<commit_message>
Adiciona trechos de codigo ao relatorio
</commit_message>
<xml_diff>
--- a/docs/RELATORIO_TECNICO_FORMATADO.docx
+++ b/docs/RELATORIO_TECNICO_FORMATADO.docx
@@ -404,7 +404,169 @@
           <w:i w:val="0"/>
           <w:sz w:val="20"/>
         </w:rPr>
-        <w:t>A implementação foi organizada em arquivos separados para deixar o projeto mais fácil de entender. Cada módulo ficou responsável por uma parte específica do firmware. Essa divisão também ajuda caso seja necessário trocar algum sensor, alterar o protocolo de comunicação ou melhorar o armazenamento depois.</w:t>
+        <w:t>A implementação foi organizada em arquivos separados para deixar o projeto mais fácil de entender. No começo até daria para colocar tudo em um arquivo só, mas isso deixaria o main.c muito grande e confuso. Como o projeto tem sensor, filtro, RTC, comunicação e armazenamento, separar por função acabou sendo mais organizado.</w:t>
+      </w:r>
+    </w:p>
+    <w:p>
+      <w:pPr>
+        <w:spacing w:after="60"/>
+        <w:ind w:firstLine="255"/>
+        <w:jc w:val="both"/>
+      </w:pPr>
+      <w:r>
+        <w:rPr>
+          <w:rFonts w:ascii="Times New Roman" w:hAnsi="Times New Roman" w:eastAsia="Times New Roman"/>
+          <w:b w:val="0"/>
+          <w:i w:val="0"/>
+          <w:sz w:val="20"/>
+        </w:rPr>
+        <w:t>Na prática, o main.c fica quase só chamando o data-logger. Quem coordena o sistema é o módulo datalogger, mostrado no trecho abaixo. Ele pega o horário, lê os sensores, salva o registro e envia os dados.</w:t>
+      </w:r>
+    </w:p>
+    <w:p>
+      <w:pPr>
+        <w:spacing w:after="0"/>
+        <w:ind w:left="142"/>
+        <w:jc w:val="left"/>
+      </w:pPr>
+      <w:r>
+        <w:rPr>
+          <w:rFonts w:ascii="Courier New" w:hAnsi="Courier New" w:eastAsia="Courier New"/>
+          <w:sz w:val="14"/>
+        </w:rPr>
+        <w:t>void datalogger_run_once(void)</w:t>
+      </w:r>
+    </w:p>
+    <w:p>
+      <w:pPr>
+        <w:spacing w:after="0"/>
+        <w:ind w:left="142"/>
+        <w:jc w:val="left"/>
+      </w:pPr>
+      <w:r>
+        <w:rPr>
+          <w:rFonts w:ascii="Courier New" w:hAnsi="Courier New" w:eastAsia="Courier New"/>
+          <w:sz w:val="14"/>
+        </w:rPr>
+        <w:t>{</w:t>
+      </w:r>
+    </w:p>
+    <w:p>
+      <w:pPr>
+        <w:spacing w:after="0"/>
+        <w:ind w:left="142"/>
+        <w:jc w:val="left"/>
+      </w:pPr>
+      <w:r>
+        <w:rPr>
+          <w:rFonts w:ascii="Courier New" w:hAnsi="Courier New" w:eastAsia="Courier New"/>
+          <w:sz w:val="14"/>
+        </w:rPr>
+        <w:t xml:space="preserve">    log_record_t record;</w:t>
+      </w:r>
+    </w:p>
+    <w:p>
+      <w:pPr>
+        <w:spacing w:after="0"/>
+        <w:ind w:left="142"/>
+        <w:jc w:val="left"/>
+      </w:pPr>
+      <w:r>
+        <w:rPr>
+          <w:rFonts w:ascii="Courier New" w:hAnsi="Courier New" w:eastAsia="Courier New"/>
+          <w:sz w:val="14"/>
+        </w:rPr>
+      </w:r>
+    </w:p>
+    <w:p>
+      <w:pPr>
+        <w:spacing w:after="0"/>
+        <w:ind w:left="142"/>
+        <w:jc w:val="left"/>
+      </w:pPr>
+      <w:r>
+        <w:rPr>
+          <w:rFonts w:ascii="Courier New" w:hAnsi="Courier New" w:eastAsia="Courier New"/>
+          <w:sz w:val="14"/>
+        </w:rPr>
+        <w:t xml:space="preserve">    (void)rtc_get_time(&amp;record.timestamp);</w:t>
+      </w:r>
+    </w:p>
+    <w:p>
+      <w:pPr>
+        <w:spacing w:after="0"/>
+        <w:ind w:left="142"/>
+        <w:jc w:val="left"/>
+      </w:pPr>
+      <w:r>
+        <w:rPr>
+          <w:rFonts w:ascii="Courier New" w:hAnsi="Courier New" w:eastAsia="Courier New"/>
+          <w:sz w:val="14"/>
+        </w:rPr>
+        <w:t xml:space="preserve">    sensors_read(&amp;record.sensors);</w:t>
+      </w:r>
+    </w:p>
+    <w:p>
+      <w:pPr>
+        <w:spacing w:after="0"/>
+        <w:ind w:left="142"/>
+        <w:jc w:val="left"/>
+      </w:pPr>
+      <w:r>
+        <w:rPr>
+          <w:rFonts w:ascii="Courier New" w:hAnsi="Courier New" w:eastAsia="Courier New"/>
+          <w:sz w:val="14"/>
+        </w:rPr>
+        <w:t xml:space="preserve">    (void)storage_save_record(&amp;record);</w:t>
+      </w:r>
+    </w:p>
+    <w:p>
+      <w:pPr>
+        <w:spacing w:after="0"/>
+        <w:ind w:left="142"/>
+        <w:jc w:val="left"/>
+      </w:pPr>
+      <w:r>
+        <w:rPr>
+          <w:rFonts w:ascii="Courier New" w:hAnsi="Courier New" w:eastAsia="Courier New"/>
+          <w:sz w:val="14"/>
+        </w:rPr>
+        <w:t xml:space="preserve">    comm_send_record(&amp;record);</w:t>
+      </w:r>
+    </w:p>
+    <w:p>
+      <w:pPr>
+        <w:spacing w:after="0"/>
+        <w:ind w:left="142"/>
+        <w:jc w:val="left"/>
+      </w:pPr>
+      <w:r>
+        <w:rPr>
+          <w:rFonts w:ascii="Courier New" w:hAnsi="Courier New" w:eastAsia="Courier New"/>
+          <w:sz w:val="14"/>
+        </w:rPr>
+        <w:t>}</w:t>
+      </w:r>
+    </w:p>
+    <w:p>
+      <w:pPr>
+        <w:spacing w:after="40"/>
+      </w:pPr>
+    </w:p>
+    <w:p>
+      <w:pPr>
+        <w:spacing w:after="60"/>
+        <w:ind w:firstLine="255"/>
+        <w:jc w:val="both"/>
+      </w:pPr>
+      <w:r>
+        <w:rPr>
+          <w:rFonts w:ascii="Times New Roman" w:hAnsi="Times New Roman" w:eastAsia="Times New Roman"/>
+          <w:b w:val="0"/>
+          <w:i w:val="0"/>
+          <w:sz w:val="20"/>
+        </w:rPr>
+        <w:t>Essa divisão não foi feita para deixar o código mais bonito apenas. Ela ajuda bastante na hora de mexer no projeto, porque se der problema na comunicação, por exemplo, não é preciso procurar no meio do código do ADC ou do filtro.</w:t>
       </w:r>
     </w:p>
     <w:p>
@@ -497,6 +659,69 @@
         </w:rPr>
         <w:t>y = y + ((x - y) &gt;&gt; FILTER_SHIFT)</w:t>
       </w:r>
+    </w:p>
+    <w:p>
+      <w:pPr>
+        <w:spacing w:after="60"/>
+        <w:ind w:firstLine="255"/>
+        <w:jc w:val="both"/>
+      </w:pPr>
+      <w:r>
+        <w:rPr>
+          <w:rFonts w:ascii="Times New Roman" w:hAnsi="Times New Roman" w:eastAsia="Times New Roman"/>
+          <w:b w:val="0"/>
+          <w:i w:val="0"/>
+          <w:sz w:val="20"/>
+        </w:rPr>
+        <w:t>No código, essa ideia aparece de forma bem direta:</w:t>
+      </w:r>
+    </w:p>
+    <w:p>
+      <w:pPr>
+        <w:spacing w:after="0"/>
+        <w:ind w:left="142"/>
+        <w:jc w:val="left"/>
+      </w:pPr>
+      <w:r>
+        <w:rPr>
+          <w:rFonts w:ascii="Courier New" w:hAnsi="Courier New" w:eastAsia="Courier New"/>
+          <w:sz w:val="14"/>
+        </w:rPr>
+        <w:t>delta = (int16_t)sample - (int16_t)filter-&gt;value;</w:t>
+      </w:r>
+    </w:p>
+    <w:p>
+      <w:pPr>
+        <w:spacing w:after="0"/>
+        <w:ind w:left="142"/>
+        <w:jc w:val="left"/>
+      </w:pPr>
+      <w:r>
+        <w:rPr>
+          <w:rFonts w:ascii="Courier New" w:hAnsi="Courier New" w:eastAsia="Courier New"/>
+          <w:sz w:val="14"/>
+        </w:rPr>
+        <w:t>filter-&gt;value = (uint16_t)((int16_t)filter-&gt;value +</w:t>
+      </w:r>
+    </w:p>
+    <w:p>
+      <w:pPr>
+        <w:spacing w:after="0"/>
+        <w:ind w:left="142"/>
+        <w:jc w:val="left"/>
+      </w:pPr>
+      <w:r>
+        <w:rPr>
+          <w:rFonts w:ascii="Courier New" w:hAnsi="Courier New" w:eastAsia="Courier New"/>
+          <w:sz w:val="14"/>
+        </w:rPr>
+        <w:t xml:space="preserve">                           (delta &gt;&gt; FILTER_SHIFT));</w:t>
+      </w:r>
+    </w:p>
+    <w:p>
+      <w:pPr>
+        <w:spacing w:after="40"/>
+      </w:pPr>
     </w:p>
     <w:p>
       <w:pPr>
@@ -667,6 +892,97 @@
         </w:rPr>
         <w:t>timestamp,temp_raw,temp_filt,light_raw,light_filt,humidity,rain,mode</w:t>
       </w:r>
+    </w:p>
+    <w:p>
+      <w:pPr>
+        <w:spacing w:after="60"/>
+        <w:ind w:firstLine="255"/>
+        <w:jc w:val="both"/>
+      </w:pPr>
+      <w:r>
+        <w:rPr>
+          <w:rFonts w:ascii="Times New Roman" w:hAnsi="Times New Roman" w:eastAsia="Times New Roman"/>
+          <w:b w:val="0"/>
+          <w:i w:val="0"/>
+          <w:sz w:val="20"/>
+        </w:rPr>
+        <w:t>Um trecho simplificado da montagem do registro é:</w:t>
+      </w:r>
+    </w:p>
+    <w:p>
+      <w:pPr>
+        <w:spacing w:after="0"/>
+        <w:ind w:left="142"/>
+        <w:jc w:val="left"/>
+      </w:pPr>
+      <w:r>
+        <w:rPr>
+          <w:rFonts w:ascii="Courier New" w:hAnsi="Courier New" w:eastAsia="Courier New"/>
+          <w:sz w:val="14"/>
+        </w:rPr>
+        <w:t>comm_send_timestamp(record);</w:t>
+      </w:r>
+    </w:p>
+    <w:p>
+      <w:pPr>
+        <w:spacing w:after="0"/>
+        <w:ind w:left="142"/>
+        <w:jc w:val="left"/>
+      </w:pPr>
+      <w:r>
+        <w:rPr>
+          <w:rFonts w:ascii="Courier New" w:hAnsi="Courier New" w:eastAsia="Courier New"/>
+          <w:sz w:val="14"/>
+        </w:rPr>
+        <w:t>usart_send_char(',');</w:t>
+      </w:r>
+    </w:p>
+    <w:p>
+      <w:pPr>
+        <w:spacing w:after="0"/>
+        <w:ind w:left="142"/>
+        <w:jc w:val="left"/>
+      </w:pPr>
+      <w:r>
+        <w:rPr>
+          <w:rFonts w:ascii="Courier New" w:hAnsi="Courier New" w:eastAsia="Courier New"/>
+          <w:sz w:val="14"/>
+        </w:rPr>
+        <w:t>usart_send_uint16(record-&gt;sensors.temperature_raw);</w:t>
+      </w:r>
+    </w:p>
+    <w:p>
+      <w:pPr>
+        <w:spacing w:after="0"/>
+        <w:ind w:left="142"/>
+        <w:jc w:val="left"/>
+      </w:pPr>
+      <w:r>
+        <w:rPr>
+          <w:rFonts w:ascii="Courier New" w:hAnsi="Courier New" w:eastAsia="Courier New"/>
+          <w:sz w:val="14"/>
+        </w:rPr>
+        <w:t>usart_send_char(',');</w:t>
+      </w:r>
+    </w:p>
+    <w:p>
+      <w:pPr>
+        <w:spacing w:after="0"/>
+        <w:ind w:left="142"/>
+        <w:jc w:val="left"/>
+      </w:pPr>
+      <w:r>
+        <w:rPr>
+          <w:rFonts w:ascii="Courier New" w:hAnsi="Courier New" w:eastAsia="Courier New"/>
+          <w:sz w:val="14"/>
+        </w:rPr>
+        <w:t>usart_send_uint16(record-&gt;sensors.temperature_filtered);</w:t>
+      </w:r>
+    </w:p>
+    <w:p>
+      <w:pPr>
+        <w:spacing w:after="40"/>
+      </w:pPr>
     </w:p>
     <w:p>
       <w:pPr>

</xml_diff>

<commit_message>
Remove referencia de figura sem imagem
</commit_message>
<xml_diff>
--- a/docs/RELATORIO_TECNICO_FORMATADO.docx
+++ b/docs/RELATORIO_TECNICO_FORMATADO.docx
@@ -359,21 +359,6 @@
           <w:sz w:val="20"/>
         </w:rPr>
         <w:t>Depois da leitura, os valores analógicos passam por um filtro digital passa-baixas. Em seguida, o registro recebe o timestamp vindo do RTC DS3231. Por fim, os dados são armazenados na EEPROM e enviados no formato CSV.</w:t>
-      </w:r>
-    </w:p>
-    <w:p>
-      <w:pPr>
-        <w:spacing w:after="60" w:before="160"/>
-        <w:jc w:val="center"/>
-      </w:pPr>
-      <w:r>
-        <w:rPr>
-          <w:rFonts w:ascii="Times New Roman" w:hAnsi="Times New Roman" w:eastAsia="Times New Roman"/>
-          <w:b w:val="0"/>
-          <w:i w:val="0"/>
-          <w:sz w:val="16"/>
-        </w:rPr>
-        <w:t>Fig. 1. Diagrama de blocos da arquitetura proposta para o sistema de monitoramento ambiental baseado no microcontrolador ATmega328P.</w:t>
       </w:r>
     </w:p>
     <w:p>

</xml_diff>